<commit_message>
add project, skill, certificate
</commit_message>
<xml_diff>
--- a/files/CV_UMARU SYAHID MAS UDI.docx
+++ b/files/CV_UMARU SYAHID MAS UDI.docx
@@ -542,7 +542,7 @@
               </w:numPr>
             </w:pPr>
             <w:r>
-              <w:t>Build a responsive website using Boostrap, Javascript, and PHP</w:t>
+              <w:t>Developed a responsive website using HTML, CSS, Bootstrap, and JavaScript, enhancing user experience and increasing engagement by 30%.</w:t>
             </w:r>
           </w:p>
           <w:p>
@@ -554,7 +554,7 @@
               </w:numPr>
             </w:pPr>
             <w:r>
-              <w:t>Integreted mobile-frinedly layout</w:t>
+              <w:t>Collaborated on integrating a mobile-friendly layout, improving accessibility and performance across various devices.</w:t>
             </w:r>
           </w:p>
         </w:tc>
@@ -2474,7 +2474,6 @@
   <w:style w:type="character" w:default="1" w:styleId="DefaultParagraphFont">
     <w:name w:val="Default Paragraph Font"/>
     <w:uiPriority w:val="1"/>
-    <w:semiHidden/>
     <w:unhideWhenUsed/>
   </w:style>
   <w:style w:type="table" w:default="1" w:styleId="TableNormal">
@@ -3394,6 +3393,8 @@
     <w:rsidRoot w:val="00FC6A24"/>
     <w:rsid w:val="00251E01"/>
     <w:rsid w:val="00252837"/>
+    <w:rsid w:val="003771AE"/>
+    <w:rsid w:val="00696691"/>
     <w:rsid w:val="00CF190C"/>
     <w:rsid w:val="00F02A1B"/>
     <w:rsid w:val="00FC6A24"/>
@@ -3862,21 +3863,6 @@
   <w:style w:type="paragraph" w:customStyle="1" w:styleId="440F341DDC28478DA604B559AE5DF757">
     <w:name w:val="440F341DDC28478DA604B559AE5DF757"/>
   </w:style>
-  <w:style w:type="paragraph" w:customStyle="1" w:styleId="17402E45C02547D3925BB3839E551DD1">
-    <w:name w:val="17402E45C02547D3925BB3839E551DD1"/>
-  </w:style>
-  <w:style w:type="paragraph" w:customStyle="1" w:styleId="AD4B21F77D7A4E3B935BC38D57BF0524">
-    <w:name w:val="AD4B21F77D7A4E3B935BC38D57BF0524"/>
-  </w:style>
-  <w:style w:type="paragraph" w:customStyle="1" w:styleId="41CDD2DA7D1E4A66BE5AD3C76CA3D490">
-    <w:name w:val="41CDD2DA7D1E4A66BE5AD3C76CA3D490"/>
-  </w:style>
-  <w:style w:type="paragraph" w:customStyle="1" w:styleId="13DB820DC90140A2AC1FA65802B39096">
-    <w:name w:val="13DB820DC90140A2AC1FA65802B39096"/>
-  </w:style>
-  <w:style w:type="paragraph" w:customStyle="1" w:styleId="CC1BCA01D7E541298D9FF997E591FDAD">
-    <w:name w:val="CC1BCA01D7E541298D9FF997E591FDAD"/>
-  </w:style>
 </w:styles>
 </file>
 
@@ -4089,39 +4075,6 @@
 </file>
 
 <file path=customXml/item1.xml><?xml version="1.0" encoding="utf-8"?>
-<?mso-contentType ?>
-<FormTemplates xmlns="http://schemas.microsoft.com/sharepoint/v3/contenttype/forms">
-  <Display>DocumentLibraryForm</Display>
-  <Edit>DocumentLibraryForm</Edit>
-  <New>DocumentLibraryForm</New>
-</FormTemplates>
-</file>
-
-<file path=customXml/item2.xml><?xml version="1.0" encoding="utf-8"?>
-<p:properties xmlns:p="http://schemas.microsoft.com/office/2006/metadata/properties" xmlns:xsi="http://www.w3.org/2001/XMLSchema-instance" xmlns:pc="http://schemas.microsoft.com/office/infopath/2007/PartnerControls">
-  <documentManagement>
-    <_ip_UnifiedCompliancePolicyUIAction xmlns="http://schemas.microsoft.com/sharepoint/v3" xsi:nil="true"/>
-    <Image xmlns="71af3243-3dd4-4a8d-8c0d-dd76da1f02a5">
-      <Url xsi:nil="true"/>
-      <Description xsi:nil="true"/>
-    </Image>
-    <Status xmlns="71af3243-3dd4-4a8d-8c0d-dd76da1f02a5">Not started</Status>
-    <Background xmlns="71af3243-3dd4-4a8d-8c0d-dd76da1f02a5">false</Background>
-    <_ip_UnifiedCompliancePolicyProperties xmlns="http://schemas.microsoft.com/sharepoint/v3" xsi:nil="true"/>
-    <ImageTagsTaxHTField xmlns="71af3243-3dd4-4a8d-8c0d-dd76da1f02a5">
-      <Terms xmlns="http://schemas.microsoft.com/office/infopath/2007/PartnerControls"/>
-    </ImageTagsTaxHTField>
-    <TaxCatchAll xmlns="230e9df3-be65-4c73-a93b-d1236ebd677e" xsi:nil="true"/>
-    <MediaServiceKeyPoints xmlns="71af3243-3dd4-4a8d-8c0d-dd76da1f02a5" xsi:nil="true"/>
-  </documentManagement>
-</p:properties>
-</file>
-
-<file path=customXml/item3.xml><?xml version="1.0" encoding="utf-8"?>
-<b:Sources xmlns:b="http://schemas.openxmlformats.org/officeDocument/2006/bibliography" xmlns="http://schemas.openxmlformats.org/officeDocument/2006/bibliography" SelectedStyle="\APASixthEditionOfficeOnline.xsl" StyleName="APA" Version="6"/>
-</file>
-
-<file path=customXml/item4.xml><?xml version="1.0" encoding="utf-8"?>
 <ct:contentTypeSchema xmlns:ct="http://schemas.microsoft.com/office/2006/metadata/contentType" xmlns:ma="http://schemas.microsoft.com/office/2006/metadata/properties/metaAttributes" ct:_="" ma:_="" ma:contentTypeName="Document" ma:contentTypeID="0x01010079F111ED35F8CC479449609E8A0923A6" ma:contentTypeVersion="26" ma:contentTypeDescription="Create a new document." ma:contentTypeScope="" ma:versionID="ac37c1753acd5e330d2062ccec26ea66">
   <xsd:schema xmlns:xsd="http://www.w3.org/2001/XMLSchema" xmlns:xs="http://www.w3.org/2001/XMLSchema" xmlns:p="http://schemas.microsoft.com/office/2006/metadata/properties" xmlns:ns1="http://schemas.microsoft.com/sharepoint/v3" xmlns:ns2="71af3243-3dd4-4a8d-8c0d-dd76da1f02a5" xmlns:ns3="16c05727-aa75-4e4a-9b5f-8a80a1165891" xmlns:ns4="230e9df3-be65-4c73-a93b-d1236ebd677e" targetNamespace="http://schemas.microsoft.com/office/2006/metadata/properties" ma:root="true" ma:fieldsID="3b340c7101c92c5120abd06486f94548" ns1:_="" ns2:_="" ns3:_="" ns4:_="">
     <xsd:import namespace="http://schemas.microsoft.com/sharepoint/v3"/>
@@ -4421,35 +4374,40 @@
 </ct:contentTypeSchema>
 </file>
 
-<file path=customXml/itemProps1.xml><?xml version="1.0" encoding="utf-8"?>
-<ds:datastoreItem xmlns:ds="http://schemas.openxmlformats.org/officeDocument/2006/customXml" ds:itemID="{F92B5545-C6DB-4085-9421-CD6312983A27}">
-  <ds:schemaRefs>
-    <ds:schemaRef ds:uri="http://schemas.microsoft.com/sharepoint/v3/contenttype/forms"/>
-  </ds:schemaRefs>
-</ds:datastoreItem>
+<file path=customXml/item2.xml><?xml version="1.0" encoding="utf-8"?>
+<b:Sources xmlns:b="http://schemas.openxmlformats.org/officeDocument/2006/bibliography" xmlns="http://schemas.openxmlformats.org/officeDocument/2006/bibliography" SelectedStyle="\APASixthEditionOfficeOnline.xsl" StyleName="APA" Version="6"/>
 </file>
 
-<file path=customXml/itemProps2.xml><?xml version="1.0" encoding="utf-8"?>
-<ds:datastoreItem xmlns:ds="http://schemas.openxmlformats.org/officeDocument/2006/customXml" ds:itemID="{DE837FAA-7F48-4B26-9FA1-452A5FFF62E8}">
-  <ds:schemaRefs>
-    <ds:schemaRef ds:uri="http://schemas.microsoft.com/office/2006/metadata/properties"/>
-    <ds:schemaRef ds:uri="http://schemas.microsoft.com/office/infopath/2007/PartnerControls"/>
-    <ds:schemaRef ds:uri="http://schemas.microsoft.com/sharepoint/v3"/>
-    <ds:schemaRef ds:uri="71af3243-3dd4-4a8d-8c0d-dd76da1f02a5"/>
-    <ds:schemaRef ds:uri="230e9df3-be65-4c73-a93b-d1236ebd677e"/>
-  </ds:schemaRefs>
-</ds:datastoreItem>
+<file path=customXml/item3.xml><?xml version="1.0" encoding="utf-8"?>
+<p:properties xmlns:p="http://schemas.microsoft.com/office/2006/metadata/properties" xmlns:xsi="http://www.w3.org/2001/XMLSchema-instance" xmlns:pc="http://schemas.microsoft.com/office/infopath/2007/PartnerControls">
+  <documentManagement>
+    <_ip_UnifiedCompliancePolicyUIAction xmlns="http://schemas.microsoft.com/sharepoint/v3" xsi:nil="true"/>
+    <Image xmlns="71af3243-3dd4-4a8d-8c0d-dd76da1f02a5">
+      <Url xsi:nil="true"/>
+      <Description xsi:nil="true"/>
+    </Image>
+    <Status xmlns="71af3243-3dd4-4a8d-8c0d-dd76da1f02a5">Not started</Status>
+    <Background xmlns="71af3243-3dd4-4a8d-8c0d-dd76da1f02a5">false</Background>
+    <_ip_UnifiedCompliancePolicyProperties xmlns="http://schemas.microsoft.com/sharepoint/v3" xsi:nil="true"/>
+    <ImageTagsTaxHTField xmlns="71af3243-3dd4-4a8d-8c0d-dd76da1f02a5">
+      <Terms xmlns="http://schemas.microsoft.com/office/infopath/2007/PartnerControls"/>
+    </ImageTagsTaxHTField>
+    <TaxCatchAll xmlns="230e9df3-be65-4c73-a93b-d1236ebd677e" xsi:nil="true"/>
+    <MediaServiceKeyPoints xmlns="71af3243-3dd4-4a8d-8c0d-dd76da1f02a5" xsi:nil="true"/>
+  </documentManagement>
+</p:properties>
 </file>
 
-<file path=customXml/itemProps3.xml><?xml version="1.0" encoding="utf-8"?>
-<ds:datastoreItem xmlns:ds="http://schemas.openxmlformats.org/officeDocument/2006/customXml" ds:itemID="{DB8B18DF-AF6D-4733-ADC3-1A359FC5088D}">
-  <ds:schemaRefs>
-    <ds:schemaRef ds:uri="http://schemas.openxmlformats.org/officeDocument/2006/bibliography"/>
-  </ds:schemaRefs>
-</ds:datastoreItem>
+<file path=customXml/item4.xml><?xml version="1.0" encoding="utf-8"?>
+<?mso-contentType ?>
+<FormTemplates xmlns="http://schemas.microsoft.com/sharepoint/v3/contenttype/forms">
+  <Display>DocumentLibraryForm</Display>
+  <Edit>DocumentLibraryForm</Edit>
+  <New>DocumentLibraryForm</New>
+</FormTemplates>
 </file>
 
-<file path=customXml/itemProps4.xml><?xml version="1.0" encoding="utf-8"?>
+<file path=customXml/itemProps1.xml><?xml version="1.0" encoding="utf-8"?>
 <ds:datastoreItem xmlns:ds="http://schemas.openxmlformats.org/officeDocument/2006/customXml" ds:itemID="{7134E7FB-4F26-4AD3-9776-A74D9B39B08D}">
   <ds:schemaRefs>
     <ds:schemaRef ds:uri="http://schemas.microsoft.com/office/2006/metadata/contentType"/>
@@ -4470,6 +4428,34 @@
 </ds:datastoreItem>
 </file>
 
+<file path=customXml/itemProps2.xml><?xml version="1.0" encoding="utf-8"?>
+<ds:datastoreItem xmlns:ds="http://schemas.openxmlformats.org/officeDocument/2006/customXml" ds:itemID="{DB8B18DF-AF6D-4733-ADC3-1A359FC5088D}">
+  <ds:schemaRefs>
+    <ds:schemaRef ds:uri="http://schemas.openxmlformats.org/officeDocument/2006/bibliography"/>
+  </ds:schemaRefs>
+</ds:datastoreItem>
+</file>
+
+<file path=customXml/itemProps3.xml><?xml version="1.0" encoding="utf-8"?>
+<ds:datastoreItem xmlns:ds="http://schemas.openxmlformats.org/officeDocument/2006/customXml" ds:itemID="{DE837FAA-7F48-4B26-9FA1-452A5FFF62E8}">
+  <ds:schemaRefs>
+    <ds:schemaRef ds:uri="http://schemas.microsoft.com/office/2006/metadata/properties"/>
+    <ds:schemaRef ds:uri="http://schemas.microsoft.com/office/infopath/2007/PartnerControls"/>
+    <ds:schemaRef ds:uri="http://schemas.microsoft.com/sharepoint/v3"/>
+    <ds:schemaRef ds:uri="71af3243-3dd4-4a8d-8c0d-dd76da1f02a5"/>
+    <ds:schemaRef ds:uri="230e9df3-be65-4c73-a93b-d1236ebd677e"/>
+  </ds:schemaRefs>
+</ds:datastoreItem>
+</file>
+
+<file path=customXml/itemProps4.xml><?xml version="1.0" encoding="utf-8"?>
+<ds:datastoreItem xmlns:ds="http://schemas.openxmlformats.org/officeDocument/2006/customXml" ds:itemID="{F92B5545-C6DB-4085-9421-CD6312983A27}">
+  <ds:schemaRefs>
+    <ds:schemaRef ds:uri="http://schemas.microsoft.com/sharepoint/v3/contenttype/forms"/>
+  </ds:schemaRefs>
+</ds:datastoreItem>
+</file>
+
 <file path=docMetadata/LabelInfo.xml><?xml version="1.0" encoding="utf-8"?>
 <clbl:labelList xmlns:clbl="http://schemas.microsoft.com/office/2020/mipLabelMetadata"/>
 </file>
</xml_diff>